<commit_message>
Standard hat neu den Abstand 1.5 Zeilen. Closes #2.
</commit_message>
<xml_diff>
--- a/Maturaarbeit/Vorlage (DE) für Maturaarbeit-SJ2627.docx
+++ b/Maturaarbeit/Vorlage (DE) für Maturaarbeit-SJ2627.docx
@@ -1598,7 +1598,6 @@
             <w:id w:val="111145805"/>
             <w:bibliography/>
           </w:sdtPr>
-          <w:sdtEndPr/>
           <w:sdtContent>
             <w:p>
               <w:r>
@@ -3266,9 +3265,9 @@
   <w:style w:type="paragraph" w:default="1" w:styleId="Standard">
     <w:name w:val="Normal"/>
     <w:qFormat/>
-    <w:rsid w:val="00E508D6"/>
+    <w:rsid w:val="009E3C55"/>
     <w:pPr>
-      <w:spacing w:after="120" w:line="312" w:lineRule="auto"/>
+      <w:spacing w:after="120" w:line="360" w:lineRule="auto"/>
     </w:pPr>
     <w:rPr>
       <w:rFonts w:ascii="Times New Roman" w:hAnsi="Times New Roman"/>

</xml_diff>